<commit_message>
Controle de contratos + exemplos para demonstração
</commit_message>
<xml_diff>
--- a/templates/termo-adesao-preliminar-scp.docx
+++ b/templates/termo-adesao-preliminar-scp.docx
@@ -1757,7 +1757,7 @@
                 <w:szCs w:val="22"/>
                 <w:rtl w:val="0"/>
               </w:rPr>
-              <w:t xml:space="preserve">{{ENTRADA}}</w:t>
+              <w:t xml:space="preserve">Entrada</w:t>
             </w:r>
           </w:p>
         </w:tc>
@@ -1785,7 +1785,7 @@
                 <w:szCs w:val="22"/>
                 <w:rtl w:val="0"/>
               </w:rPr>
-              <w:t xml:space="preserve">{{QNTD}}</w:t>
+              <w:t xml:space="preserve">[SCP_ENTRADA_QNTD]</w:t>
             </w:r>
           </w:p>
         </w:tc>
@@ -1813,7 +1813,7 @@
                 <w:szCs w:val="22"/>
                 <w:rtl w:val="0"/>
               </w:rPr>
-              <w:t xml:space="preserve">{{VALOR}}</w:t>
+              <w:t xml:space="preserve">[SCP_ENTRADA_VALOR]</w:t>
             </w:r>
           </w:p>
         </w:tc>
@@ -1841,7 +1841,7 @@
                 <w:szCs w:val="22"/>
                 <w:rtl w:val="0"/>
               </w:rPr>
-              <w:t xml:space="preserve">{{VALOR_TOTAL}}</w:t>
+              <w:t xml:space="preserve">[SCP_ENTRADA_TOTAL]</w:t>
             </w:r>
           </w:p>
         </w:tc>
@@ -1875,7 +1875,7 @@
                 <w:szCs w:val="22"/>
                 <w:rtl w:val="0"/>
               </w:rPr>
-              <w:t xml:space="preserve">{{PARCELA_MENSAL}}</w:t>
+              <w:t xml:space="preserve">Parcela mensal</w:t>
             </w:r>
           </w:p>
         </w:tc>
@@ -1903,7 +1903,7 @@
                 <w:szCs w:val="22"/>
                 <w:rtl w:val="0"/>
               </w:rPr>
-              <w:t xml:space="preserve">{{QNTD_MENSAL}}</w:t>
+              <w:t xml:space="preserve">[SCP_MENSAL_QNTD]</w:t>
             </w:r>
           </w:p>
         </w:tc>
@@ -1931,7 +1931,7 @@
                 <w:szCs w:val="22"/>
                 <w:rtl w:val="0"/>
               </w:rPr>
-              <w:t xml:space="preserve">{{VALOR_MENSAL}}</w:t>
+              <w:t xml:space="preserve">[SCP_MENSAL_VALOR]</w:t>
             </w:r>
           </w:p>
         </w:tc>
@@ -1959,7 +1959,7 @@
                 <w:szCs w:val="22"/>
                 <w:rtl w:val="0"/>
               </w:rPr>
-              <w:t xml:space="preserve">{{VALOR_TOTAL_MENSAL}}</w:t>
+              <w:t xml:space="preserve">[SCP_MENSAL_TOTAL]</w:t>
             </w:r>
           </w:p>
         </w:tc>
@@ -1993,7 +1993,7 @@
                 <w:szCs w:val="22"/>
                 <w:rtl w:val="0"/>
               </w:rPr>
-              <w:t xml:space="preserve">{{PARCELA_INTERMEDIARIA}}</w:t>
+              <w:t xml:space="preserve">Parcela intermediária</w:t>
             </w:r>
           </w:p>
         </w:tc>
@@ -2021,7 +2021,7 @@
                 <w:szCs w:val="22"/>
                 <w:rtl w:val="0"/>
               </w:rPr>
-              <w:t xml:space="preserve">{{QNTD_INTERMEDIARIA}}</w:t>
+              <w:t xml:space="preserve">[SCP_INTERMEDIARIA_QNTD]</w:t>
             </w:r>
           </w:p>
         </w:tc>
@@ -2049,7 +2049,7 @@
                 <w:szCs w:val="22"/>
                 <w:rtl w:val="0"/>
               </w:rPr>
-              <w:t xml:space="preserve">{{VALOR_INTERMEDIARIA}}</w:t>
+              <w:t xml:space="preserve">[SCP_INTERMEDIARIA_VALOR]</w:t>
             </w:r>
           </w:p>
         </w:tc>
@@ -2077,7 +2077,7 @@
                 <w:szCs w:val="22"/>
                 <w:rtl w:val="0"/>
               </w:rPr>
-              <w:t xml:space="preserve">{{VALOR_TOTAL_INTERMEDIARIA}}</w:t>
+              <w:t xml:space="preserve">[SCP_INTERMEDIARIA_TOTAL]</w:t>
             </w:r>
           </w:p>
         </w:tc>
@@ -2111,7 +2111,7 @@
                 <w:szCs w:val="22"/>
                 <w:rtl w:val="0"/>
               </w:rPr>
-              <w:t xml:space="preserve">{{PARCELA_ANUAL}}</w:t>
+              <w:t xml:space="preserve">Parcela anual</w:t>
             </w:r>
           </w:p>
         </w:tc>
@@ -2139,7 +2139,7 @@
                 <w:szCs w:val="22"/>
                 <w:rtl w:val="0"/>
               </w:rPr>
-              <w:t xml:space="preserve">{{QNTD_ANUAL}}</w:t>
+              <w:t xml:space="preserve">[SCP_ANUAL_QNTD]</w:t>
             </w:r>
           </w:p>
         </w:tc>
@@ -2167,7 +2167,7 @@
                 <w:szCs w:val="22"/>
                 <w:rtl w:val="0"/>
               </w:rPr>
-              <w:t xml:space="preserve">{{VALOR_ANUAL}}</w:t>
+              <w:t xml:space="preserve">[SCP_ANUAL_VALOR]</w:t>
             </w:r>
           </w:p>
         </w:tc>
@@ -2195,7 +2195,7 @@
                 <w:szCs w:val="22"/>
                 <w:rtl w:val="0"/>
               </w:rPr>
-              <w:t xml:space="preserve">{{VALOR_TOTAL_ANUAL}}</w:t>
+              <w:t xml:space="preserve">[SCP_ANUAL_TOTAL]</w:t>
             </w:r>
           </w:p>
         </w:tc>
@@ -2229,7 +2229,7 @@
                 <w:szCs w:val="22"/>
                 <w:rtl w:val="0"/>
               </w:rPr>
-              <w:t xml:space="preserve">{{PARCELA_CHAVE}}</w:t>
+              <w:t xml:space="preserve">Parcela nas chaves</w:t>
             </w:r>
           </w:p>
         </w:tc>
@@ -2257,7 +2257,7 @@
                 <w:szCs w:val="22"/>
                 <w:rtl w:val="0"/>
               </w:rPr>
-              <w:t xml:space="preserve">{{QNTD_CHAVE}}</w:t>
+              <w:t xml:space="preserve">[SCP_CHAVE_QNTD]</w:t>
             </w:r>
           </w:p>
         </w:tc>
@@ -2285,7 +2285,7 @@
                 <w:szCs w:val="22"/>
                 <w:rtl w:val="0"/>
               </w:rPr>
-              <w:t xml:space="preserve">{{VALOR_CHAVE}}</w:t>
+              <w:t xml:space="preserve">[SCP_CHAVE_VALOR]</w:t>
             </w:r>
           </w:p>
         </w:tc>
@@ -2313,7 +2313,7 @@
                 <w:szCs w:val="22"/>
                 <w:rtl w:val="0"/>
               </w:rPr>
-              <w:t xml:space="preserve">{{VALOR_TOTAL_CHAVE}}</w:t>
+              <w:t xml:space="preserve">[SCP_CHAVE_TOTAL]</w:t>
             </w:r>
           </w:p>
         </w:tc>

</xml_diff>